<commit_message>
docs: calibración de los pesos de la pérdida, fuentes consultadas, fragmentos en contacto y despliegue con Cloudflare
</commit_message>
<xml_diff>
--- a/docs/informe/Informe_tecnico_PENGWIN.docx
+++ b/docs/informe/Informe_tecnico_PENGWIN.docx
@@ -1899,7 +1899,7 @@
                 <w:sz w:val="18"/>
                 <w:szCs w:val="18"/>
               </w:rPr>
-              <w:t xml:space="preserve">EMA de pesos (0.999)</w:t>
+              <w:t xml:space="preserve">384 px por corte (el enunciado recomienda 224–256)</w:t>
             </w:r>
           </w:p>
         </w:tc>
@@ -1931,7 +1931,7 @@
                 <w:sz w:val="18"/>
                 <w:szCs w:val="18"/>
               </w:rPr>
-              <w:t xml:space="preserve">Estabiliza el entrenamiento</w:t>
+              <w:t xml:space="preserve">Hay fragmentos desde 9 cortes y menos de 500 mm³; a 256 px ocupan muy pocos píxeles</w:t>
             </w:r>
           </w:p>
         </w:tc>
@@ -1963,7 +1963,7 @@
                 <w:sz w:val="18"/>
                 <w:szCs w:val="18"/>
               </w:rPr>
-              <w:t xml:space="preserve">+0.004 de media en 3 semillas</w:t>
+              <w:t xml:space="preserve">Fue parte de los cambios que subieron el Dice por fragmento de 0.667 a ~0.82 en la primera versión de la Semana 10; batch 16 con precisión mixta cabe en una GPU T4</w:t>
             </w:r>
           </w:p>
         </w:tc>
@@ -1998,6 +1998,106 @@
                 <w:sz w:val="18"/>
                 <w:szCs w:val="18"/>
               </w:rPr>
+              <w:t xml:space="preserve">EMA de pesos (0.999)</w:t>
+            </w:r>
+          </w:p>
+        </w:tc>
+        <w:tc>
+          <w:tcPr>
+            <w:tcW w:type="dxa" w:w="3800"/>
+            <w:tcBorders>
+              <w:top w:val="single" w:color="C9D3DF" w:sz="4"/>
+              <w:left w:val="single" w:color="C9D3DF" w:sz="4"/>
+              <w:bottom w:val="single" w:color="C9D3DF" w:sz="4"/>
+              <w:right w:val="single" w:color="C9D3DF" w:sz="4"/>
+            </w:tcBorders>
+            <w:shd w:fill="F7F9FC" w:color="auto" w:val="clear"/>
+            <w:tcMar>
+              <w:top w:type="dxa" w:w="60"/>
+              <w:left w:type="dxa" w:w="100"/>
+              <w:bottom w:type="dxa" w:w="60"/>
+              <w:right w:type="dxa" w:w="100"/>
+            </w:tcMar>
+          </w:tcPr>
+          <w:p>
+            <w:pPr>
+              <w:jc w:val="center"/>
+            </w:pPr>
+            <w:r>
+              <w:rPr>
+                <w:b w:val="false"/>
+                <w:bCs w:val="false"/>
+                <w:color w:val="1B1B1B"/>
+                <w:sz w:val="18"/>
+                <w:szCs w:val="18"/>
+              </w:rPr>
+              <w:t xml:space="preserve">Estabiliza el entrenamiento</w:t>
+            </w:r>
+          </w:p>
+        </w:tc>
+        <w:tc>
+          <w:tcPr>
+            <w:tcW w:type="dxa" w:w="2960"/>
+            <w:tcBorders>
+              <w:top w:val="single" w:color="C9D3DF" w:sz="4"/>
+              <w:left w:val="single" w:color="C9D3DF" w:sz="4"/>
+              <w:bottom w:val="single" w:color="C9D3DF" w:sz="4"/>
+              <w:right w:val="single" w:color="C9D3DF" w:sz="4"/>
+            </w:tcBorders>
+            <w:shd w:fill="F7F9FC" w:color="auto" w:val="clear"/>
+            <w:tcMar>
+              <w:top w:type="dxa" w:w="60"/>
+              <w:left w:type="dxa" w:w="100"/>
+              <w:bottom w:type="dxa" w:w="60"/>
+              <w:right w:type="dxa" w:w="100"/>
+            </w:tcMar>
+          </w:tcPr>
+          <w:p>
+            <w:pPr>
+              <w:jc w:val="center"/>
+            </w:pPr>
+            <w:r>
+              <w:rPr>
+                <w:b w:val="false"/>
+                <w:bCs w:val="false"/>
+                <w:color w:val="1B1B1B"/>
+                <w:sz w:val="18"/>
+                <w:szCs w:val="18"/>
+              </w:rPr>
+              <w:t xml:space="preserve">+0.004 de media en 3 semillas</w:t>
+            </w:r>
+          </w:p>
+        </w:tc>
+      </w:tr>
+      <w:tr>
+        <w:tc>
+          <w:tcPr>
+            <w:tcW w:type="dxa" w:w="2600"/>
+            <w:tcBorders>
+              <w:top w:val="single" w:color="C9D3DF" w:sz="4"/>
+              <w:left w:val="single" w:color="C9D3DF" w:sz="4"/>
+              <w:bottom w:val="single" w:color="C9D3DF" w:sz="4"/>
+              <w:right w:val="single" w:color="C9D3DF" w:sz="4"/>
+            </w:tcBorders>
+            <w:tcMar>
+              <w:top w:type="dxa" w:w="60"/>
+              <w:left w:type="dxa" w:w="100"/>
+              <w:bottom w:type="dxa" w:w="60"/>
+              <w:right w:type="dxa" w:w="100"/>
+            </w:tcMar>
+          </w:tcPr>
+          <w:p>
+            <w:pPr>
+              <w:jc w:val="left"/>
+            </w:pPr>
+            <w:r>
+              <w:rPr>
+                <w:b/>
+                <w:bCs/>
+                <w:color w:val="1B1B1B"/>
+                <w:sz w:val="18"/>
+                <w:szCs w:val="18"/>
+              </w:rPr>
               <w:t xml:space="preserve">Orientación canónica + aumento geométrico</w:t>
             </w:r>
           </w:p>
@@ -2011,7 +2111,6 @@
               <w:bottom w:val="single" w:color="C9D3DF" w:sz="4"/>
               <w:right w:val="single" w:color="C9D3DF" w:sz="4"/>
             </w:tcBorders>
-            <w:shd w:fill="F7F9FC" w:color="auto" w:val="clear"/>
             <w:tcMar>
               <w:top w:type="dxa" w:w="60"/>
               <w:left w:type="dxa" w:w="100"/>
@@ -2044,7 +2143,6 @@
               <w:bottom w:val="single" w:color="C9D3DF" w:sz="4"/>
               <w:right w:val="single" w:color="C9D3DF" w:sz="4"/>
             </w:tcBorders>
-            <w:shd w:fill="F7F9FC" w:color="auto" w:val="clear"/>
             <w:tcMar>
               <w:top w:type="dxa" w:w="60"/>
               <w:left w:type="dxa" w:w="100"/>
@@ -2070,6 +2168,27 @@
         </w:tc>
       </w:tr>
     </w:tbl>
+    <w:p>
+      <w:pPr>
+        <w:spacing w:after="80"/>
+      </w:pPr>
+    </w:p>
+    <w:p>
+      <w:pPr>
+        <w:spacing w:after="120" w:line="288"/>
+        <w:jc w:val="both"/>
+      </w:pPr>
+      <w:r>
+        <w:rPr>
+          <w:b/>
+          <w:bCs/>
+        </w:rPr>
+        <w:t xml:space="preserve">Fuentes consultadas. </w:t>
+      </w:r>
+      <w:r>
+        <w:t xml:space="preserve">Para la cabeza de detección se consultó el principio de grid de YOLO (Redmon et al., 2016): cada celda predice la caja del objeto cuyo centro cae en ella. La supresión de no máximos sigue el algoritmo estándar por IoU. Ambas están implementadas por el equipo (src/week9_detection.py), sin código, pesos ni librerías de YOLO, Detectron2 o Mask R-CNN, y se verificaron con 19 pruebas unitarias.</w:t>
+      </w:r>
+    </w:p>
     <w:p>
       <w:pPr>
         <w:pStyle w:val="Heading1"/>
@@ -2568,6 +2687,995 @@
         </w:tc>
       </w:tr>
     </w:tbl>
+    <w:p>
+      <w:pPr>
+        <w:pStyle w:val="Heading2"/>
+      </w:pPr>
+      <w:r>
+        <w:t xml:space="preserve">Calibración de los pesos de la pérdida</w:t>
+      </w:r>
+    </w:p>
+    <w:p>
+      <w:pPr>
+        <w:spacing w:after="120" w:line="288"/>
+        <w:jc w:val="both"/>
+      </w:pPr>
+      <w:r>
+        <w:t xml:space="preserve">Los pesos no se copiaron de otra implementación: cada uno responde a una propiedad medida de los datos o del entrenamiento, y las alternativas se probaron una a una sobre la receta base (validación, Dice por fragmento de referencia 0.849).</w:t>
+      </w:r>
+    </w:p>
+    <w:tbl>
+      <w:tblPr>
+        <w:tblW w:type="dxa" w:w="9360"/>
+        <w:tblBorders>
+          <w:top w:val="single" w:color="auto" w:sz="4"/>
+          <w:left w:val="single" w:color="auto" w:sz="4"/>
+          <w:bottom w:val="single" w:color="auto" w:sz="4"/>
+          <w:right w:val="single" w:color="auto" w:sz="4"/>
+          <w:insideH w:val="single" w:color="auto" w:sz="4"/>
+          <w:insideV w:val="single" w:color="auto" w:sz="4"/>
+        </w:tblBorders>
+      </w:tblPr>
+      <w:tblGrid>
+        <w:gridCol w:w="2200"/>
+        <w:gridCol w:w="900"/>
+        <w:gridCol w:w="3260"/>
+        <w:gridCol w:w="3000"/>
+      </w:tblGrid>
+      <w:tr>
+        <w:trPr>
+          <w:tblHeader/>
+        </w:trPr>
+        <w:tc>
+          <w:tcPr>
+            <w:tcW w:type="dxa" w:w="2200"/>
+            <w:tcBorders>
+              <w:top w:val="single" w:color="C9D3DF" w:sz="4"/>
+              <w:left w:val="single" w:color="C9D3DF" w:sz="4"/>
+              <w:bottom w:val="single" w:color="C9D3DF" w:sz="4"/>
+              <w:right w:val="single" w:color="C9D3DF" w:sz="4"/>
+            </w:tcBorders>
+            <w:shd w:fill="1F3A5F" w:color="auto" w:val="clear"/>
+            <w:tcMar>
+              <w:top w:type="dxa" w:w="60"/>
+              <w:left w:type="dxa" w:w="100"/>
+              <w:bottom w:type="dxa" w:w="60"/>
+              <w:right w:type="dxa" w:w="100"/>
+            </w:tcMar>
+          </w:tcPr>
+          <w:p>
+            <w:pPr>
+              <w:jc w:val="left"/>
+            </w:pPr>
+            <w:r>
+              <w:rPr>
+                <w:b/>
+                <w:bCs/>
+                <w:color w:val="FFFFFF"/>
+                <w:sz w:val="18"/>
+                <w:szCs w:val="18"/>
+              </w:rPr>
+              <w:t xml:space="preserve">Término</w:t>
+            </w:r>
+          </w:p>
+        </w:tc>
+        <w:tc>
+          <w:tcPr>
+            <w:tcW w:type="dxa" w:w="900"/>
+            <w:tcBorders>
+              <w:top w:val="single" w:color="C9D3DF" w:sz="4"/>
+              <w:left w:val="single" w:color="C9D3DF" w:sz="4"/>
+              <w:bottom w:val="single" w:color="C9D3DF" w:sz="4"/>
+              <w:right w:val="single" w:color="C9D3DF" w:sz="4"/>
+            </w:tcBorders>
+            <w:shd w:fill="1F3A5F" w:color="auto" w:val="clear"/>
+            <w:tcMar>
+              <w:top w:type="dxa" w:w="60"/>
+              <w:left w:type="dxa" w:w="100"/>
+              <w:bottom w:type="dxa" w:w="60"/>
+              <w:right w:type="dxa" w:w="100"/>
+            </w:tcMar>
+          </w:tcPr>
+          <w:p>
+            <w:pPr>
+              <w:jc w:val="center"/>
+            </w:pPr>
+            <w:r>
+              <w:rPr>
+                <w:b/>
+                <w:bCs/>
+                <w:color w:val="FFFFFF"/>
+                <w:sz w:val="18"/>
+                <w:szCs w:val="18"/>
+              </w:rPr>
+              <w:t xml:space="preserve">Peso</w:t>
+            </w:r>
+          </w:p>
+        </w:tc>
+        <w:tc>
+          <w:tcPr>
+            <w:tcW w:type="dxa" w:w="3260"/>
+            <w:tcBorders>
+              <w:top w:val="single" w:color="C9D3DF" w:sz="4"/>
+              <w:left w:val="single" w:color="C9D3DF" w:sz="4"/>
+              <w:bottom w:val="single" w:color="C9D3DF" w:sz="4"/>
+              <w:right w:val="single" w:color="C9D3DF" w:sz="4"/>
+            </w:tcBorders>
+            <w:shd w:fill="1F3A5F" w:color="auto" w:val="clear"/>
+            <w:tcMar>
+              <w:top w:type="dxa" w:w="60"/>
+              <w:left w:type="dxa" w:w="100"/>
+              <w:bottom w:type="dxa" w:w="60"/>
+              <w:right w:type="dxa" w:w="100"/>
+            </w:tcMar>
+          </w:tcPr>
+          <w:p>
+            <w:pPr>
+              <w:jc w:val="center"/>
+            </w:pPr>
+            <w:r>
+              <w:rPr>
+                <w:b/>
+                <w:bCs/>
+                <w:color w:val="FFFFFF"/>
+                <w:sz w:val="18"/>
+                <w:szCs w:val="18"/>
+              </w:rPr>
+              <w:t xml:space="preserve">Por qué</w:t>
+            </w:r>
+          </w:p>
+        </w:tc>
+        <w:tc>
+          <w:tcPr>
+            <w:tcW w:type="dxa" w:w="3000"/>
+            <w:tcBorders>
+              <w:top w:val="single" w:color="C9D3DF" w:sz="4"/>
+              <w:left w:val="single" w:color="C9D3DF" w:sz="4"/>
+              <w:bottom w:val="single" w:color="C9D3DF" w:sz="4"/>
+              <w:right w:val="single" w:color="C9D3DF" w:sz="4"/>
+            </w:tcBorders>
+            <w:shd w:fill="1F3A5F" w:color="auto" w:val="clear"/>
+            <w:tcMar>
+              <w:top w:type="dxa" w:w="60"/>
+              <w:left w:type="dxa" w:w="100"/>
+              <w:bottom w:type="dxa" w:w="60"/>
+              <w:right w:type="dxa" w:w="100"/>
+            </w:tcMar>
+          </w:tcPr>
+          <w:p>
+            <w:pPr>
+              <w:jc w:val="center"/>
+            </w:pPr>
+            <w:r>
+              <w:rPr>
+                <w:b/>
+                <w:bCs/>
+                <w:color w:val="FFFFFF"/>
+                <w:sz w:val="18"/>
+                <w:szCs w:val="18"/>
+              </w:rPr>
+              <w:t xml:space="preserve">Evidencia</w:t>
+            </w:r>
+          </w:p>
+        </w:tc>
+      </w:tr>
+      <w:tr>
+        <w:tc>
+          <w:tcPr>
+            <w:tcW w:type="dxa" w:w="2200"/>
+            <w:tcBorders>
+              <w:top w:val="single" w:color="C9D3DF" w:sz="4"/>
+              <w:left w:val="single" w:color="C9D3DF" w:sz="4"/>
+              <w:bottom w:val="single" w:color="C9D3DF" w:sz="4"/>
+              <w:right w:val="single" w:color="C9D3DF" w:sz="4"/>
+            </w:tcBorders>
+            <w:tcMar>
+              <w:top w:type="dxa" w:w="60"/>
+              <w:left w:type="dxa" w:w="100"/>
+              <w:bottom w:type="dxa" w:w="60"/>
+              <w:right w:type="dxa" w:w="100"/>
+            </w:tcMar>
+          </w:tcPr>
+          <w:p>
+            <w:pPr>
+              <w:jc w:val="left"/>
+            </w:pPr>
+            <w:r>
+              <w:rPr>
+                <w:b/>
+                <w:bCs/>
+                <w:color w:val="1B1B1B"/>
+                <w:sz w:val="18"/>
+                <w:szCs w:val="18"/>
+              </w:rPr>
+              <w:t xml:space="preserve">Clasificación (BCE)</w:t>
+            </w:r>
+          </w:p>
+        </w:tc>
+        <w:tc>
+          <w:tcPr>
+            <w:tcW w:type="dxa" w:w="900"/>
+            <w:tcBorders>
+              <w:top w:val="single" w:color="C9D3DF" w:sz="4"/>
+              <w:left w:val="single" w:color="C9D3DF" w:sz="4"/>
+              <w:bottom w:val="single" w:color="C9D3DF" w:sz="4"/>
+              <w:right w:val="single" w:color="C9D3DF" w:sz="4"/>
+            </w:tcBorders>
+            <w:tcMar>
+              <w:top w:type="dxa" w:w="60"/>
+              <w:left w:type="dxa" w:w="100"/>
+              <w:bottom w:type="dxa" w:w="60"/>
+              <w:right w:type="dxa" w:w="100"/>
+            </w:tcMar>
+          </w:tcPr>
+          <w:p>
+            <w:pPr>
+              <w:jc w:val="left"/>
+            </w:pPr>
+            <w:r>
+              <w:rPr>
+                <w:b w:val="false"/>
+                <w:bCs w:val="false"/>
+                <w:color w:val="1B1B1B"/>
+                <w:sz w:val="18"/>
+                <w:szCs w:val="18"/>
+              </w:rPr>
+              <w:t xml:space="preserve">0.5</w:t>
+            </w:r>
+          </w:p>
+        </w:tc>
+        <w:tc>
+          <w:tcPr>
+            <w:tcW w:type="dxa" w:w="3260"/>
+            <w:tcBorders>
+              <w:top w:val="single" w:color="C9D3DF" w:sz="4"/>
+              <w:left w:val="single" w:color="C9D3DF" w:sz="4"/>
+              <w:bottom w:val="single" w:color="C9D3DF" w:sz="4"/>
+              <w:right w:val="single" w:color="C9D3DF" w:sz="4"/>
+            </w:tcBorders>
+            <w:tcMar>
+              <w:top w:type="dxa" w:w="60"/>
+              <w:left w:type="dxa" w:w="100"/>
+              <w:bottom w:type="dxa" w:w="60"/>
+              <w:right w:type="dxa" w:w="100"/>
+            </w:tcMar>
+          </w:tcPr>
+          <w:p>
+            <w:pPr>
+              <w:jc w:val="left"/>
+            </w:pPr>
+            <w:r>
+              <w:rPr>
+                <w:b w:val="false"/>
+                <w:bCs w:val="false"/>
+                <w:color w:val="1B1B1B"/>
+                <w:sz w:val="18"/>
+                <w:szCs w:val="18"/>
+              </w:rPr>
+              <w:t xml:space="preserve">Es la tarea más fácil: converge primero y, con peso 1, sus gradientes competirían con tareas que aún no aprenden</w:t>
+            </w:r>
+          </w:p>
+        </w:tc>
+        <w:tc>
+          <w:tcPr>
+            <w:tcW w:type="dxa" w:w="3000"/>
+            <w:tcBorders>
+              <w:top w:val="single" w:color="C9D3DF" w:sz="4"/>
+              <w:left w:val="single" w:color="C9D3DF" w:sz="4"/>
+              <w:bottom w:val="single" w:color="C9D3DF" w:sz="4"/>
+              <w:right w:val="single" w:color="C9D3DF" w:sz="4"/>
+            </w:tcBorders>
+            <w:tcMar>
+              <w:top w:type="dxa" w:w="60"/>
+              <w:left w:type="dxa" w:w="100"/>
+              <w:bottom w:type="dxa" w:w="60"/>
+              <w:right w:type="dxa" w:w="100"/>
+            </w:tcMar>
+          </w:tcPr>
+          <w:p>
+            <w:pPr>
+              <w:jc w:val="left"/>
+            </w:pPr>
+            <w:r>
+              <w:rPr>
+                <w:b w:val="false"/>
+                <w:bCs w:val="false"/>
+                <w:color w:val="1B1B1B"/>
+                <w:sz w:val="18"/>
+                <w:szCs w:val="18"/>
+              </w:rPr>
+              <w:t xml:space="preserve">En la época 1 de H6 el F1 ya es 0.907, mientras la detección va en mAP@0.5 0.287 y la instancia en 0.529</w:t>
+            </w:r>
+          </w:p>
+        </w:tc>
+      </w:tr>
+      <w:tr>
+        <w:tc>
+          <w:tcPr>
+            <w:tcW w:type="dxa" w:w="2200"/>
+            <w:tcBorders>
+              <w:top w:val="single" w:color="C9D3DF" w:sz="4"/>
+              <w:left w:val="single" w:color="C9D3DF" w:sz="4"/>
+              <w:bottom w:val="single" w:color="C9D3DF" w:sz="4"/>
+              <w:right w:val="single" w:color="C9D3DF" w:sz="4"/>
+            </w:tcBorders>
+            <w:shd w:fill="F7F9FC" w:color="auto" w:val="clear"/>
+            <w:tcMar>
+              <w:top w:type="dxa" w:w="60"/>
+              <w:left w:type="dxa" w:w="100"/>
+              <w:bottom w:type="dxa" w:w="60"/>
+              <w:right w:type="dxa" w:w="100"/>
+            </w:tcMar>
+          </w:tcPr>
+          <w:p>
+            <w:pPr>
+              <w:jc w:val="left"/>
+            </w:pPr>
+            <w:r>
+              <w:rPr>
+                <w:b/>
+                <w:bCs/>
+                <w:color w:val="1B1B1B"/>
+                <w:sz w:val="18"/>
+                <w:szCs w:val="18"/>
+              </w:rPr>
+              <w:t xml:space="preserve">Semántica (CE)</w:t>
+            </w:r>
+          </w:p>
+        </w:tc>
+        <w:tc>
+          <w:tcPr>
+            <w:tcW w:type="dxa" w:w="900"/>
+            <w:tcBorders>
+              <w:top w:val="single" w:color="C9D3DF" w:sz="4"/>
+              <w:left w:val="single" w:color="C9D3DF" w:sz="4"/>
+              <w:bottom w:val="single" w:color="C9D3DF" w:sz="4"/>
+              <w:right w:val="single" w:color="C9D3DF" w:sz="4"/>
+            </w:tcBorders>
+            <w:shd w:fill="F7F9FC" w:color="auto" w:val="clear"/>
+            <w:tcMar>
+              <w:top w:type="dxa" w:w="60"/>
+              <w:left w:type="dxa" w:w="100"/>
+              <w:bottom w:type="dxa" w:w="60"/>
+              <w:right w:type="dxa" w:w="100"/>
+            </w:tcMar>
+          </w:tcPr>
+          <w:p>
+            <w:pPr>
+              <w:jc w:val="left"/>
+            </w:pPr>
+            <w:r>
+              <w:rPr>
+                <w:b w:val="false"/>
+                <w:bCs w:val="false"/>
+                <w:color w:val="1B1B1B"/>
+                <w:sz w:val="18"/>
+                <w:szCs w:val="18"/>
+              </w:rPr>
+              <w:t xml:space="preserve">2.0</w:t>
+            </w:r>
+          </w:p>
+        </w:tc>
+        <w:tc>
+          <w:tcPr>
+            <w:tcW w:type="dxa" w:w="3260"/>
+            <w:tcBorders>
+              <w:top w:val="single" w:color="C9D3DF" w:sz="4"/>
+              <w:left w:val="single" w:color="C9D3DF" w:sz="4"/>
+              <w:bottom w:val="single" w:color="C9D3DF" w:sz="4"/>
+              <w:right w:val="single" w:color="C9D3DF" w:sz="4"/>
+            </w:tcBorders>
+            <w:shd w:fill="F7F9FC" w:color="auto" w:val="clear"/>
+            <w:tcMar>
+              <w:top w:type="dxa" w:w="60"/>
+              <w:left w:type="dxa" w:w="100"/>
+              <w:bottom w:type="dxa" w:w="60"/>
+              <w:right w:type="dxa" w:w="100"/>
+            </w:tcMar>
+          </w:tcPr>
+          <w:p>
+            <w:pPr>
+              <w:jc w:val="left"/>
+            </w:pPr>
+            <w:r>
+              <w:rPr>
+                <w:b w:val="false"/>
+                <w:bCs w:val="false"/>
+                <w:color w:val="1B1B1B"/>
+                <w:sz w:val="18"/>
+                <w:szCs w:val="18"/>
+              </w:rPr>
+              <w:t xml:space="preserve">Es la primera etapa de la lógica de dos etapas: un error de región arrastra a todos sus fragmentos</w:t>
+            </w:r>
+          </w:p>
+        </w:tc>
+        <w:tc>
+          <w:tcPr>
+            <w:tcW w:type="dxa" w:w="3000"/>
+            <w:tcBorders>
+              <w:top w:val="single" w:color="C9D3DF" w:sz="4"/>
+              <w:left w:val="single" w:color="C9D3DF" w:sz="4"/>
+              <w:bottom w:val="single" w:color="C9D3DF" w:sz="4"/>
+              <w:right w:val="single" w:color="C9D3DF" w:sz="4"/>
+            </w:tcBorders>
+            <w:shd w:fill="F7F9FC" w:color="auto" w:val="clear"/>
+            <w:tcMar>
+              <w:top w:type="dxa" w:w="60"/>
+              <w:left w:type="dxa" w:w="100"/>
+              <w:bottom w:type="dxa" w:w="60"/>
+              <w:right w:type="dxa" w:w="100"/>
+            </w:tcMar>
+          </w:tcPr>
+          <w:p>
+            <w:pPr>
+              <w:jc w:val="left"/>
+            </w:pPr>
+            <w:r>
+              <w:rPr>
+                <w:b w:val="false"/>
+                <w:bCs w:val="false"/>
+                <w:color w:val="1B1B1B"/>
+                <w:sz w:val="18"/>
+                <w:szCs w:val="18"/>
+              </w:rPr>
+              <w:t xml:space="preserve">Bajar su peso relativo (λ×2 en instancia) no mejora los fragmentos</w:t>
+            </w:r>
+          </w:p>
+        </w:tc>
+      </w:tr>
+      <w:tr>
+        <w:tc>
+          <w:tcPr>
+            <w:tcW w:type="dxa" w:w="2200"/>
+            <w:tcBorders>
+              <w:top w:val="single" w:color="C9D3DF" w:sz="4"/>
+              <w:left w:val="single" w:color="C9D3DF" w:sz="4"/>
+              <w:bottom w:val="single" w:color="C9D3DF" w:sz="4"/>
+              <w:right w:val="single" w:color="C9D3DF" w:sz="4"/>
+            </w:tcBorders>
+            <w:tcMar>
+              <w:top w:type="dxa" w:w="60"/>
+              <w:left w:type="dxa" w:w="100"/>
+              <w:bottom w:type="dxa" w:w="60"/>
+              <w:right w:type="dxa" w:w="100"/>
+            </w:tcMar>
+          </w:tcPr>
+          <w:p>
+            <w:pPr>
+              <w:jc w:val="left"/>
+            </w:pPr>
+            <w:r>
+              <w:rPr>
+                <w:b/>
+                <w:bCs/>
+                <w:color w:val="1B1B1B"/>
+                <w:sz w:val="18"/>
+                <w:szCs w:val="18"/>
+              </w:rPr>
+              <w:t xml:space="preserve">Detección, instancia, Dice semántico y Dice de instancia</w:t>
+            </w:r>
+          </w:p>
+        </w:tc>
+        <w:tc>
+          <w:tcPr>
+            <w:tcW w:type="dxa" w:w="900"/>
+            <w:tcBorders>
+              <w:top w:val="single" w:color="C9D3DF" w:sz="4"/>
+              <w:left w:val="single" w:color="C9D3DF" w:sz="4"/>
+              <w:bottom w:val="single" w:color="C9D3DF" w:sz="4"/>
+              <w:right w:val="single" w:color="C9D3DF" w:sz="4"/>
+            </w:tcBorders>
+            <w:tcMar>
+              <w:top w:type="dxa" w:w="60"/>
+              <w:left w:type="dxa" w:w="100"/>
+              <w:bottom w:type="dxa" w:w="60"/>
+              <w:right w:type="dxa" w:w="100"/>
+            </w:tcMar>
+          </w:tcPr>
+          <w:p>
+            <w:pPr>
+              <w:jc w:val="left"/>
+            </w:pPr>
+            <w:r>
+              <w:rPr>
+                <w:b w:val="false"/>
+                <w:bCs w:val="false"/>
+                <w:color w:val="1B1B1B"/>
+                <w:sz w:val="18"/>
+                <w:szCs w:val="18"/>
+              </w:rPr>
+              <w:t xml:space="preserve">1.0</w:t>
+            </w:r>
+          </w:p>
+        </w:tc>
+        <w:tc>
+          <w:tcPr>
+            <w:tcW w:type="dxa" w:w="3260"/>
+            <w:tcBorders>
+              <w:top w:val="single" w:color="C9D3DF" w:sz="4"/>
+              <w:left w:val="single" w:color="C9D3DF" w:sz="4"/>
+              <w:bottom w:val="single" w:color="C9D3DF" w:sz="4"/>
+              <w:right w:val="single" w:color="C9D3DF" w:sz="4"/>
+            </w:tcBorders>
+            <w:tcMar>
+              <w:top w:type="dxa" w:w="60"/>
+              <w:left w:type="dxa" w:w="100"/>
+              <w:bottom w:type="dxa" w:w="60"/>
+              <w:right w:type="dxa" w:w="100"/>
+            </w:tcMar>
+          </w:tcPr>
+          <w:p>
+            <w:pPr>
+              <w:jc w:val="left"/>
+            </w:pPr>
+            <w:r>
+              <w:rPr>
+                <w:b w:val="false"/>
+                <w:bCs w:val="false"/>
+                <w:color w:val="1B1B1B"/>
+                <w:sz w:val="18"/>
+                <w:szCs w:val="18"/>
+              </w:rPr>
+              <w:t xml:space="preserve">Peso de referencia; los términos Dice no dependen de la cantidad de píxeles y compensan el desbalance</w:t>
+            </w:r>
+          </w:p>
+        </w:tc>
+        <w:tc>
+          <w:tcPr>
+            <w:tcW w:type="dxa" w:w="3000"/>
+            <w:tcBorders>
+              <w:top w:val="single" w:color="C9D3DF" w:sz="4"/>
+              <w:left w:val="single" w:color="C9D3DF" w:sz="4"/>
+              <w:bottom w:val="single" w:color="C9D3DF" w:sz="4"/>
+              <w:right w:val="single" w:color="C9D3DF" w:sz="4"/>
+            </w:tcBorders>
+            <w:tcMar>
+              <w:top w:type="dxa" w:w="60"/>
+              <w:left w:type="dxa" w:w="100"/>
+              <w:bottom w:type="dxa" w:w="60"/>
+              <w:right w:type="dxa" w:w="100"/>
+            </w:tcMar>
+          </w:tcPr>
+          <w:p>
+            <w:pPr>
+              <w:jc w:val="left"/>
+            </w:pPr>
+            <w:r>
+              <w:rPr>
+                <w:b w:val="false"/>
+                <w:bCs w:val="false"/>
+                <w:color w:val="1B1B1B"/>
+                <w:sz w:val="18"/>
+                <w:szCs w:val="18"/>
+              </w:rPr>
+              <w:t xml:space="preserve">λ×2 (instancia y borde ×2, detección ×0.5): fragmentos 0.849, sin cambio; detección cruda de 0.868 a 0.832</w:t>
+            </w:r>
+          </w:p>
+        </w:tc>
+      </w:tr>
+      <w:tr>
+        <w:tc>
+          <w:tcPr>
+            <w:tcW w:type="dxa" w:w="2200"/>
+            <w:tcBorders>
+              <w:top w:val="single" w:color="C9D3DF" w:sz="4"/>
+              <w:left w:val="single" w:color="C9D3DF" w:sz="4"/>
+              <w:bottom w:val="single" w:color="C9D3DF" w:sz="4"/>
+              <w:right w:val="single" w:color="C9D3DF" w:sz="4"/>
+            </w:tcBorders>
+            <w:shd w:fill="F7F9FC" w:color="auto" w:val="clear"/>
+            <w:tcMar>
+              <w:top w:type="dxa" w:w="60"/>
+              <w:left w:type="dxa" w:w="100"/>
+              <w:bottom w:type="dxa" w:w="60"/>
+              <w:right w:type="dxa" w:w="100"/>
+            </w:tcMar>
+          </w:tcPr>
+          <w:p>
+            <w:pPr>
+              <w:jc w:val="left"/>
+            </w:pPr>
+            <w:r>
+              <w:rPr>
+                <w:b/>
+                <w:bCs/>
+                <w:color w:val="1B1B1B"/>
+                <w:sz w:val="18"/>
+                <w:szCs w:val="18"/>
+              </w:rPr>
+              <w:t xml:space="preserve">Fondo en la CE semántica / de instancia</w:t>
+            </w:r>
+          </w:p>
+        </w:tc>
+        <w:tc>
+          <w:tcPr>
+            <w:tcW w:type="dxa" w:w="900"/>
+            <w:tcBorders>
+              <w:top w:val="single" w:color="C9D3DF" w:sz="4"/>
+              <w:left w:val="single" w:color="C9D3DF" w:sz="4"/>
+              <w:bottom w:val="single" w:color="C9D3DF" w:sz="4"/>
+              <w:right w:val="single" w:color="C9D3DF" w:sz="4"/>
+            </w:tcBorders>
+            <w:shd w:fill="F7F9FC" w:color="auto" w:val="clear"/>
+            <w:tcMar>
+              <w:top w:type="dxa" w:w="60"/>
+              <w:left w:type="dxa" w:w="100"/>
+              <w:bottom w:type="dxa" w:w="60"/>
+              <w:right w:type="dxa" w:w="100"/>
+            </w:tcMar>
+          </w:tcPr>
+          <w:p>
+            <w:pPr>
+              <w:jc w:val="left"/>
+            </w:pPr>
+            <w:r>
+              <w:rPr>
+                <w:b w:val="false"/>
+                <w:bCs w:val="false"/>
+                <w:color w:val="1B1B1B"/>
+                <w:sz w:val="18"/>
+                <w:szCs w:val="18"/>
+              </w:rPr>
+              <w:t xml:space="preserve">0.2 / 0.1</w:t>
+            </w:r>
+          </w:p>
+        </w:tc>
+        <w:tc>
+          <w:tcPr>
+            <w:tcW w:type="dxa" w:w="3260"/>
+            <w:tcBorders>
+              <w:top w:val="single" w:color="C9D3DF" w:sz="4"/>
+              <w:left w:val="single" w:color="C9D3DF" w:sz="4"/>
+              <w:bottom w:val="single" w:color="C9D3DF" w:sz="4"/>
+              <w:right w:val="single" w:color="C9D3DF" w:sz="4"/>
+            </w:tcBorders>
+            <w:shd w:fill="F7F9FC" w:color="auto" w:val="clear"/>
+            <w:tcMar>
+              <w:top w:type="dxa" w:w="60"/>
+              <w:left w:type="dxa" w:w="100"/>
+              <w:bottom w:type="dxa" w:w="60"/>
+              <w:right w:type="dxa" w:w="100"/>
+            </w:tcMar>
+          </w:tcPr>
+          <w:p>
+            <w:pPr>
+              <w:jc w:val="left"/>
+            </w:pPr>
+            <w:r>
+              <w:rPr>
+                <w:b w:val="false"/>
+                <w:bCs w:val="false"/>
+                <w:color w:val="1B1B1B"/>
+                <w:sz w:val="18"/>
+                <w:szCs w:val="18"/>
+              </w:rPr>
+              <w:t xml:space="preserve">El fondo es el 98.1 % de los vóxeles de train (≈ 97.5 % en los cortes con hueso)</w:t>
+            </w:r>
+          </w:p>
+        </w:tc>
+        <w:tc>
+          <w:tcPr>
+            <w:tcW w:type="dxa" w:w="3000"/>
+            <w:tcBorders>
+              <w:top w:val="single" w:color="C9D3DF" w:sz="4"/>
+              <w:left w:val="single" w:color="C9D3DF" w:sz="4"/>
+              <w:bottom w:val="single" w:color="C9D3DF" w:sz="4"/>
+              <w:right w:val="single" w:color="C9D3DF" w:sz="4"/>
+            </w:tcBorders>
+            <w:shd w:fill="F7F9FC" w:color="auto" w:val="clear"/>
+            <w:tcMar>
+              <w:top w:type="dxa" w:w="60"/>
+              <w:left w:type="dxa" w:w="100"/>
+              <w:bottom w:type="dxa" w:w="60"/>
+              <w:right w:type="dxa" w:w="100"/>
+            </w:tcMar>
+          </w:tcPr>
+          <w:p>
+            <w:pPr>
+              <w:jc w:val="left"/>
+            </w:pPr>
+            <w:r>
+              <w:rPr>
+                <w:b w:val="false"/>
+                <w:bCs w:val="false"/>
+                <w:color w:val="1B1B1B"/>
+                <w:sz w:val="18"/>
+                <w:szCs w:val="18"/>
+              </w:rPr>
+              <w:t xml:space="preserve">Proporción medida en los 70 casos de train</w:t>
+            </w:r>
+          </w:p>
+        </w:tc>
+      </w:tr>
+      <w:tr>
+        <w:tc>
+          <w:tcPr>
+            <w:tcW w:type="dxa" w:w="2200"/>
+            <w:tcBorders>
+              <w:top w:val="single" w:color="C9D3DF" w:sz="4"/>
+              <w:left w:val="single" w:color="C9D3DF" w:sz="4"/>
+              <w:bottom w:val="single" w:color="C9D3DF" w:sz="4"/>
+              <w:right w:val="single" w:color="C9D3DF" w:sz="4"/>
+            </w:tcBorders>
+            <w:tcMar>
+              <w:top w:type="dxa" w:w="60"/>
+              <w:left w:type="dxa" w:w="100"/>
+              <w:bottom w:type="dxa" w:w="60"/>
+              <w:right w:type="dxa" w:w="100"/>
+            </w:tcMar>
+          </w:tcPr>
+          <w:p>
+            <w:pPr>
+              <w:jc w:val="left"/>
+            </w:pPr>
+            <w:r>
+              <w:rPr>
+                <w:b/>
+                <w:bCs/>
+                <w:color w:val="1B1B1B"/>
+                <w:sz w:val="18"/>
+                <w:szCs w:val="18"/>
+              </w:rPr>
+              <w:t xml:space="preserve">Fragmentos secundarios en la CE de instancia</w:t>
+            </w:r>
+          </w:p>
+        </w:tc>
+        <w:tc>
+          <w:tcPr>
+            <w:tcW w:type="dxa" w:w="900"/>
+            <w:tcBorders>
+              <w:top w:val="single" w:color="C9D3DF" w:sz="4"/>
+              <w:left w:val="single" w:color="C9D3DF" w:sz="4"/>
+              <w:bottom w:val="single" w:color="C9D3DF" w:sz="4"/>
+              <w:right w:val="single" w:color="C9D3DF" w:sz="4"/>
+            </w:tcBorders>
+            <w:tcMar>
+              <w:top w:type="dxa" w:w="60"/>
+              <w:left w:type="dxa" w:w="100"/>
+              <w:bottom w:type="dxa" w:w="60"/>
+              <w:right w:type="dxa" w:w="100"/>
+            </w:tcMar>
+          </w:tcPr>
+          <w:p>
+            <w:pPr>
+              <w:jc w:val="left"/>
+            </w:pPr>
+            <w:r>
+              <w:rPr>
+                <w:b w:val="false"/>
+                <w:bCs w:val="false"/>
+                <w:color w:val="1B1B1B"/>
+                <w:sz w:val="18"/>
+                <w:szCs w:val="18"/>
+              </w:rPr>
+              <w:t xml:space="preserve">×3</w:t>
+            </w:r>
+          </w:p>
+        </w:tc>
+        <w:tc>
+          <w:tcPr>
+            <w:tcW w:type="dxa" w:w="3260"/>
+            <w:tcBorders>
+              <w:top w:val="single" w:color="C9D3DF" w:sz="4"/>
+              <w:left w:val="single" w:color="C9D3DF" w:sz="4"/>
+              <w:bottom w:val="single" w:color="C9D3DF" w:sz="4"/>
+              <w:right w:val="single" w:color="C9D3DF" w:sz="4"/>
+            </w:tcBorders>
+            <w:tcMar>
+              <w:top w:type="dxa" w:w="60"/>
+              <w:left w:type="dxa" w:w="100"/>
+              <w:bottom w:type="dxa" w:w="60"/>
+              <w:right w:type="dxa" w:w="100"/>
+            </w:tcMar>
+          </w:tcPr>
+          <w:p>
+            <w:pPr>
+              <w:jc w:val="left"/>
+            </w:pPr>
+            <w:r>
+              <w:rPr>
+                <w:b w:val="false"/>
+                <w:bCs w:val="false"/>
+                <w:color w:val="1B1B1B"/>
+                <w:sz w:val="18"/>
+                <w:szCs w:val="18"/>
+              </w:rPr>
+              <w:t xml:space="preserve">Son el 47.9 % de los fragmentos pero solo el 10.1 % de los vóxeles de hueso (≈ 9:1). Compensar del todo (×9) sobrepondera; ×3 es el compromiso</w:t>
+            </w:r>
+          </w:p>
+        </w:tc>
+        <w:tc>
+          <w:tcPr>
+            <w:tcW w:type="dxa" w:w="3000"/>
+            <w:tcBorders>
+              <w:top w:val="single" w:color="C9D3DF" w:sz="4"/>
+              <w:left w:val="single" w:color="C9D3DF" w:sz="4"/>
+              <w:bottom w:val="single" w:color="C9D3DF" w:sz="4"/>
+              <w:right w:val="single" w:color="C9D3DF" w:sz="4"/>
+            </w:tcBorders>
+            <w:tcMar>
+              <w:top w:type="dxa" w:w="60"/>
+              <w:left w:type="dxa" w:w="100"/>
+              <w:bottom w:type="dxa" w:w="60"/>
+              <w:right w:type="dxa" w:w="100"/>
+            </w:tcMar>
+          </w:tcPr>
+          <w:p>
+            <w:pPr>
+              <w:jc w:val="left"/>
+            </w:pPr>
+            <w:r>
+              <w:rPr>
+                <w:b w:val="false"/>
+                <w:bCs w:val="false"/>
+                <w:color w:val="1B1B1B"/>
+                <w:sz w:val="18"/>
+                <w:szCs w:val="18"/>
+              </w:rPr>
+              <w:t xml:space="preserve">Barrido: ×3 (B1) frente a ×6 (B2, peor detección; 0.820 en otra receta) y sobremuestreo ×3 (D6: 0.837, peor)</w:t>
+            </w:r>
+          </w:p>
+        </w:tc>
+      </w:tr>
+      <w:tr>
+        <w:tc>
+          <w:tcPr>
+            <w:tcW w:type="dxa" w:w="2200"/>
+            <w:tcBorders>
+              <w:top w:val="single" w:color="C9D3DF" w:sz="4"/>
+              <w:left w:val="single" w:color="C9D3DF" w:sz="4"/>
+              <w:bottom w:val="single" w:color="C9D3DF" w:sz="4"/>
+              <w:right w:val="single" w:color="C9D3DF" w:sz="4"/>
+            </w:tcBorders>
+            <w:shd w:fill="F7F9FC" w:color="auto" w:val="clear"/>
+            <w:tcMar>
+              <w:top w:type="dxa" w:w="60"/>
+              <w:left w:type="dxa" w:w="100"/>
+              <w:bottom w:type="dxa" w:w="60"/>
+              <w:right w:type="dxa" w:w="100"/>
+            </w:tcMar>
+          </w:tcPr>
+          <w:p>
+            <w:pPr>
+              <w:jc w:val="left"/>
+            </w:pPr>
+            <w:r>
+              <w:rPr>
+                <w:b/>
+                <w:bCs/>
+                <w:color w:val="1B1B1B"/>
+                <w:sz w:val="18"/>
+                <w:szCs w:val="18"/>
+              </w:rPr>
+              <w:t xml:space="preserve">Peso por fractura, focal, Tversky, supervisión profunda</w:t>
+            </w:r>
+          </w:p>
+        </w:tc>
+        <w:tc>
+          <w:tcPr>
+            <w:tcW w:type="dxa" w:w="900"/>
+            <w:tcBorders>
+              <w:top w:val="single" w:color="C9D3DF" w:sz="4"/>
+              <w:left w:val="single" w:color="C9D3DF" w:sz="4"/>
+              <w:bottom w:val="single" w:color="C9D3DF" w:sz="4"/>
+              <w:right w:val="single" w:color="C9D3DF" w:sz="4"/>
+            </w:tcBorders>
+            <w:shd w:fill="F7F9FC" w:color="auto" w:val="clear"/>
+            <w:tcMar>
+              <w:top w:type="dxa" w:w="60"/>
+              <w:left w:type="dxa" w:w="100"/>
+              <w:bottom w:type="dxa" w:w="60"/>
+              <w:right w:type="dxa" w:w="100"/>
+            </w:tcMar>
+          </w:tcPr>
+          <w:p>
+            <w:pPr>
+              <w:jc w:val="left"/>
+            </w:pPr>
+            <w:r>
+              <w:rPr>
+                <w:b w:val="false"/>
+                <w:bCs w:val="false"/>
+                <w:color w:val="1B1B1B"/>
+                <w:sz w:val="18"/>
+                <w:szCs w:val="18"/>
+              </w:rPr>
+              <w:t xml:space="preserve">0</w:t>
+            </w:r>
+          </w:p>
+        </w:tc>
+        <w:tc>
+          <w:tcPr>
+            <w:tcW w:type="dxa" w:w="3260"/>
+            <w:tcBorders>
+              <w:top w:val="single" w:color="C9D3DF" w:sz="4"/>
+              <w:left w:val="single" w:color="C9D3DF" w:sz="4"/>
+              <w:bottom w:val="single" w:color="C9D3DF" w:sz="4"/>
+              <w:right w:val="single" w:color="C9D3DF" w:sz="4"/>
+            </w:tcBorders>
+            <w:shd w:fill="F7F9FC" w:color="auto" w:val="clear"/>
+            <w:tcMar>
+              <w:top w:type="dxa" w:w="60"/>
+              <w:left w:type="dxa" w:w="100"/>
+              <w:bottom w:type="dxa" w:w="60"/>
+              <w:right w:type="dxa" w:w="100"/>
+            </w:tcMar>
+          </w:tcPr>
+          <w:p>
+            <w:pPr>
+              <w:jc w:val="left"/>
+            </w:pPr>
+            <w:r>
+              <w:rPr>
+                <w:b w:val="false"/>
+                <w:bCs w:val="false"/>
+                <w:color w:val="1B1B1B"/>
+                <w:sz w:val="18"/>
+                <w:szCs w:val="18"/>
+              </w:rPr>
+              <w:t xml:space="preserve">Alternativas para los secundarios y los bordes de fractura</w:t>
+            </w:r>
+          </w:p>
+        </w:tc>
+        <w:tc>
+          <w:tcPr>
+            <w:tcW w:type="dxa" w:w="3000"/>
+            <w:tcBorders>
+              <w:top w:val="single" w:color="C9D3DF" w:sz="4"/>
+              <w:left w:val="single" w:color="C9D3DF" w:sz="4"/>
+              <w:bottom w:val="single" w:color="C9D3DF" w:sz="4"/>
+              <w:right w:val="single" w:color="C9D3DF" w:sz="4"/>
+            </w:tcBorders>
+            <w:shd w:fill="F7F9FC" w:color="auto" w:val="clear"/>
+            <w:tcMar>
+              <w:top w:type="dxa" w:w="60"/>
+              <w:left w:type="dxa" w:w="100"/>
+              <w:bottom w:type="dxa" w:w="60"/>
+              <w:right w:type="dxa" w:w="100"/>
+            </w:tcMar>
+          </w:tcPr>
+          <w:p>
+            <w:pPr>
+              <w:jc w:val="left"/>
+            </w:pPr>
+            <w:r>
+              <w:rPr>
+                <w:b w:val="false"/>
+                <w:bCs w:val="false"/>
+                <w:color w:val="1B1B1B"/>
+                <w:sz w:val="18"/>
+                <w:szCs w:val="18"/>
+              </w:rPr>
+              <w:t xml:space="preserve">Ninguna supera el ruido: 0.832, 0.846, 0.846 y 0.846</w:t>
+            </w:r>
+          </w:p>
+        </w:tc>
+      </w:tr>
+    </w:tbl>
+    <w:p>
+      <w:pPr>
+        <w:spacing w:after="80"/>
+      </w:pPr>
+    </w:p>
+    <w:p>
+      <w:pPr>
+        <w:spacing w:after="120" w:line="288"/>
+        <w:jc w:val="both"/>
+      </w:pPr>
+      <w:r>
+        <w:t xml:space="preserve">Dos términos auxiliares no tuvieron barrido propio y se declaran así: el mapa de centros pondera sus píxeles positivos por 21 (1 + 20 × objetivo), la práctica habitual para mapas de calor con muy pocos positivos; y la pérdida de bordes usa pos_weight 3.0 con un Dice suavizado. </w:t>
+      </w:r>
+      <w:r>
+        <w:rPr>
+          <w:b/>
+          <w:bCs/>
+        </w:rPr>
+        <w:t xml:space="preserve">El diagnóstico mostró que la cabeza de bordes quedaba inactiva en todos los modelos</w:t>
+      </w:r>
+      <w:r>
+        <w:t xml:space="preserve"> (probabilidad máxima 0.0005), porque esa combinación premia predecir cero. Reentrenarla con un peso calculado del desbalance la reactivó, pero el Dice por fragmento solo cambió +0.001, así que H6 la conserva sin efecto práctico.</w:t>
+      </w:r>
+    </w:p>
     <w:p>
       <w:pPr>
         <w:pStyle w:val="Heading1"/>
@@ -9045,6 +10153,19 @@
       </w:pPr>
       <w:r>
         <w:t xml:space="preserve">Woo, S. et al. CBAM: Convolutional Block Attention Module. ECCV, 2018.</w:t>
+      </w:r>
+    </w:p>
+    <w:p>
+      <w:pPr>
+        <w:pStyle w:val="ListParagraph"/>
+        <w:numPr>
+          <w:ilvl w:val="0"/>
+          <w:numId w:val="2"/>
+        </w:numPr>
+        <w:spacing w:after="60" w:line="276"/>
+      </w:pPr>
+      <w:r>
+        <w:t xml:space="preserve">Redmon, J. et al. You Only Look Once: Unified, Real-Time Object Detection. CVPR, 2016 (consultado solo como principio del grid; implementación propia).</w:t>
       </w:r>
     </w:p>
     <w:p>

</xml_diff>